<commit_message>
Added Test Plan document
</commit_message>
<xml_diff>
--- a/QA_Documents/Live_Campus_Hub_Test_Plan.docx
+++ b/QA_Documents/Live_Campus_Hub_Test_Plan.docx
@@ -79,7 +79,19 @@
         <w:rPr>
           <w:rFonts w:ascii="Times New Roman" w:hAnsi="Times New Roman" w:cs="Times New Roman"/>
         </w:rPr>
-        <w:t>Date: 09/04/2026</w:t>
+        <w:t>Date: 09/0</w:t>
+      </w:r>
+      <w:r>
+        <w:rPr>
+          <w:rFonts w:ascii="Times New Roman" w:hAnsi="Times New Roman" w:cs="Times New Roman"/>
+        </w:rPr>
+        <w:t>3</w:t>
+      </w:r>
+      <w:r>
+        <w:rPr>
+          <w:rFonts w:ascii="Times New Roman" w:hAnsi="Times New Roman" w:cs="Times New Roman"/>
+        </w:rPr>
+        <w:t>/2026</w:t>
       </w:r>
     </w:p>
     <w:p>

</xml_diff>

<commit_message>
Updated Test Plan document
</commit_message>
<xml_diff>
--- a/QA_Documents/Live_Campus_Hub_Test_Plan.docx
+++ b/QA_Documents/Live_Campus_Hub_Test_Plan.docx
@@ -8593,7 +8593,21 @@
                 <w:rFonts w:ascii="Times New Roman" w:hAnsi="Times New Roman" w:cs="Times New Roman"/>
                 <w:lang w:val="en-US"/>
               </w:rPr>
-              <w:t>12/04/2026</w:t>
+              <w:t>12/0</w:t>
+            </w:r>
+            <w:r>
+              <w:rPr>
+                <w:rFonts w:ascii="Times New Roman" w:hAnsi="Times New Roman" w:cs="Times New Roman"/>
+                <w:lang w:val="en-US"/>
+              </w:rPr>
+              <w:t>3</w:t>
+            </w:r>
+            <w:r>
+              <w:rPr>
+                <w:rFonts w:ascii="Times New Roman" w:hAnsi="Times New Roman" w:cs="Times New Roman"/>
+                <w:lang w:val="en-US"/>
+              </w:rPr>
+              <w:t>/2026</w:t>
             </w:r>
           </w:p>
         </w:tc>
@@ -8697,7 +8711,21 @@
                 <w:rFonts w:ascii="Times New Roman" w:hAnsi="Times New Roman" w:cs="Times New Roman"/>
                 <w:lang w:val="en-US"/>
               </w:rPr>
-              <w:t>12/04/2026</w:t>
+              <w:t>12/0</w:t>
+            </w:r>
+            <w:r>
+              <w:rPr>
+                <w:rFonts w:ascii="Times New Roman" w:hAnsi="Times New Roman" w:cs="Times New Roman"/>
+                <w:lang w:val="en-US"/>
+              </w:rPr>
+              <w:t>3</w:t>
+            </w:r>
+            <w:r>
+              <w:rPr>
+                <w:rFonts w:ascii="Times New Roman" w:hAnsi="Times New Roman" w:cs="Times New Roman"/>
+                <w:lang w:val="en-US"/>
+              </w:rPr>
+              <w:t>/2026</w:t>
             </w:r>
           </w:p>
         </w:tc>
@@ -8801,7 +8829,21 @@
                 <w:rFonts w:ascii="Times New Roman" w:hAnsi="Times New Roman" w:cs="Times New Roman"/>
                 <w:lang w:val="en-US"/>
               </w:rPr>
-              <w:t>10/04/2026</w:t>
+              <w:t>10/0</w:t>
+            </w:r>
+            <w:r>
+              <w:rPr>
+                <w:rFonts w:ascii="Times New Roman" w:hAnsi="Times New Roman" w:cs="Times New Roman"/>
+                <w:lang w:val="en-US"/>
+              </w:rPr>
+              <w:t>3</w:t>
+            </w:r>
+            <w:r>
+              <w:rPr>
+                <w:rFonts w:ascii="Times New Roman" w:hAnsi="Times New Roman" w:cs="Times New Roman"/>
+                <w:lang w:val="en-US"/>
+              </w:rPr>
+              <w:t>/2026</w:t>
             </w:r>
           </w:p>
         </w:tc>
@@ -8905,7 +8947,21 @@
                 <w:rFonts w:ascii="Times New Roman" w:hAnsi="Times New Roman" w:cs="Times New Roman"/>
                 <w:lang w:val="en-US"/>
               </w:rPr>
-              <w:t>14/04/2026</w:t>
+              <w:t>14/0</w:t>
+            </w:r>
+            <w:r>
+              <w:rPr>
+                <w:rFonts w:ascii="Times New Roman" w:hAnsi="Times New Roman" w:cs="Times New Roman"/>
+                <w:lang w:val="en-US"/>
+              </w:rPr>
+              <w:t>3</w:t>
+            </w:r>
+            <w:r>
+              <w:rPr>
+                <w:rFonts w:ascii="Times New Roman" w:hAnsi="Times New Roman" w:cs="Times New Roman"/>
+                <w:lang w:val="en-US"/>
+              </w:rPr>
+              <w:t>/2026</w:t>
             </w:r>
           </w:p>
         </w:tc>
@@ -9012,7 +9068,21 @@
                 <w:rFonts w:ascii="Times New Roman" w:hAnsi="Times New Roman" w:cs="Times New Roman"/>
                 <w:lang w:val="en-US"/>
               </w:rPr>
-              <w:t>11/04/2026</w:t>
+              <w:t>11/0</w:t>
+            </w:r>
+            <w:r>
+              <w:rPr>
+                <w:rFonts w:ascii="Times New Roman" w:hAnsi="Times New Roman" w:cs="Times New Roman"/>
+                <w:lang w:val="en-US"/>
+              </w:rPr>
+              <w:t>3</w:t>
+            </w:r>
+            <w:r>
+              <w:rPr>
+                <w:rFonts w:ascii="Times New Roman" w:hAnsi="Times New Roman" w:cs="Times New Roman"/>
+                <w:lang w:val="en-US"/>
+              </w:rPr>
+              <w:t>/2026</w:t>
             </w:r>
           </w:p>
         </w:tc>

</xml_diff>